<commit_message>
Add test-only EAN samples and official GTIN-8 space
</commit_message>
<xml_diff>
--- a/docs/partners/product-packets/got-winter-dosar-produs.docx
+++ b/docs/partners/product-packets/got-winter-dosar-produs.docx
@@ -77,7 +77,7 @@
           </w:tcPr>
           <w:p>
             <w:r>
-              <w:t>GTIN EAN oficial</w:t>
+              <w:t>GTIN-8 / EAN-8 oficial</w:t>
             </w:r>
           </w:p>
         </w:tc>
@@ -87,7 +87,29 @@
           </w:tcPr>
           <w:p>
             <w:r>
-              <w:t>[De completat după alocarea GS1; nu folosiți un număr de test]</w:t>
+              <w:t>[Completați numai dacă acest format a fost alocat de GS1]</w:t>
+            </w:r>
+          </w:p>
+        </w:tc>
+      </w:tr>
+      <w:tr>
+        <w:tc>
+          <w:tcPr>
+            <w:tcW w:type="dxa" w:w="4929"/>
+          </w:tcPr>
+          <w:p>
+            <w:r>
+              <w:t>GTIN-13 / EAN-13 oficial</w:t>
+            </w:r>
+          </w:p>
+        </w:tc>
+        <w:tc>
+          <w:tcPr>
+            <w:tcW w:type="dxa" w:w="4929"/>
+          </w:tcPr>
+          <w:p>
+            <w:r>
+              <w:t>[Completați numai dacă acest format a fost alocat de GS1]</w:t>
             </w:r>
           </w:p>
         </w:tc>

</xml_diff>